<commit_message>
docs(lab3): update cover to college template
Виконав: Бондаренко Сергій. Нова титулка за зразком із повною назвою закладу. Основний текст та чотири архітектурні схеми збережено.
</commit_message>
<xml_diff>
--- a/docs/Lab3/Report.docx
+++ b/docs/Lab3/Report.docx
@@ -4,133 +4,150 @@
   <w:body>
     <w:p>
       <w:pPr>
+        <w:keepNext w:val="0"/>
+        <w:keepLines/>
+        <w:spacing w:before="0" w:after="0" w:line="240" w:lineRule="auto"/>
         <w:jc w:val="center"/>
       </w:pPr>
       <w:r>
         <w:rPr>
-          <w:rFonts w:ascii="DejaVu Serif" w:hAnsi="DejaVu Serif"/>
+          <w:rFonts w:ascii="Times New Roman" w:hAnsi="Times New Roman"/>
+          <w:b/>
+          <w:color w:val="000000"/>
+          <w:sz w:val="28"/>
+        </w:rPr>
+        <w:t>Відокремлений структурний підрозділ</w:t>
+        <w:br/>
+        <w:t>«Економіко-технологічний фаховий коледж</w:t>
+        <w:br/>
+        <w:t>Херсонського національного технічного університету»</w:t>
+      </w:r>
+    </w:p>
+    <w:p>
+      <w:pPr>
+        <w:keepNext w:val="0"/>
+        <w:keepLines/>
+        <w:spacing w:before="0" w:after="1460" w:line="20" w:lineRule="exact"/>
+        <w:jc w:val="center"/>
+      </w:pPr>
+      <w:r>
+        <w:rPr>
+          <w:rFonts w:ascii="Times New Roman" w:hAnsi="Times New Roman"/>
+          <w:b w:val="0"/>
+          <w:color w:val="000000"/>
+          <w:sz w:val="2"/>
+        </w:rPr>
+      </w:r>
+    </w:p>
+    <w:p>
+      <w:pPr>
+        <w:pStyle w:val="Title"/>
+        <w:keepNext w:val="0"/>
+        <w:keepLines/>
+        <w:spacing w:before="0" w:after="0" w:line="240" w:lineRule="auto"/>
+        <w:jc w:val="center"/>
+      </w:pPr>
+      <w:r>
+        <w:rPr>
+          <w:rFonts w:ascii="Times New Roman" w:hAnsi="Times New Roman"/>
+          <w:b/>
+          <w:color w:val="000000"/>
+          <w:sz w:val="28"/>
+        </w:rPr>
+        <w:t>ПРАКТИЧНА РОБОТА № 3</w:t>
+      </w:r>
+    </w:p>
+    <w:p>
+      <w:pPr>
+        <w:keepNext w:val="0"/>
+        <w:keepLines/>
+        <w:spacing w:before="200" w:after="0" w:line="240" w:lineRule="auto"/>
+        <w:jc w:val="center"/>
+      </w:pPr>
+      <w:r>
+        <w:rPr>
+          <w:rFonts w:ascii="Times New Roman" w:hAnsi="Times New Roman"/>
           <w:b w:val="0"/>
           <w:color w:val="000000"/>
           <w:sz w:val="28"/>
         </w:rPr>
-        <w:t>Проєктний практикум</w:t>
+        <w:t>з дисципліни «Проєктний практикум»</w:t>
       </w:r>
     </w:p>
     <w:p>
       <w:pPr>
-        <w:spacing w:after="760"/>
-      </w:pPr>
-      <w:r/>
-    </w:p>
-    <w:p>
-      <w:pPr>
-        <w:pStyle w:val="Title"/>
+        <w:keepNext w:val="0"/>
+        <w:keepLines/>
+        <w:spacing w:before="300" w:after="0" w:line="240" w:lineRule="auto"/>
         <w:jc w:val="center"/>
       </w:pPr>
       <w:r>
-        <w:t>Звіт з лабораторної роботи 3</w:t>
+        <w:rPr>
+          <w:rFonts w:ascii="Times New Roman" w:hAnsi="Times New Roman"/>
+          <w:b/>
+          <w:color w:val="000000"/>
+          <w:sz w:val="28"/>
+        </w:rPr>
+        <w:t>Тема: «Проєктування архітектури даних та інтерфейсу»</w:t>
       </w:r>
     </w:p>
     <w:p>
       <w:pPr>
-        <w:pStyle w:val="Subtitle"/>
+        <w:keepNext w:val="0"/>
+        <w:keepLines/>
+        <w:spacing w:before="160" w:after="0" w:line="240" w:lineRule="auto"/>
         <w:jc w:val="center"/>
       </w:pPr>
       <w:r>
-        <w:t>Проєктування архітектури даних та інтерфейсу</w:t>
+        <w:rPr>
+          <w:rFonts w:ascii="Times New Roman" w:hAnsi="Times New Roman"/>
+          <w:b w:val="0"/>
+          <w:color w:val="000000"/>
+          <w:sz w:val="28"/>
+        </w:rPr>
+        <w:t>Проєкт «EasyStock»</w:t>
       </w:r>
     </w:p>
     <w:p>
       <w:pPr>
-        <w:jc w:val="center"/>
+        <w:keepNext w:val="0"/>
+        <w:keepLines/>
+        <w:spacing w:before="1800" w:after="0" w:line="240" w:lineRule="auto"/>
+        <w:ind w:left="4320"/>
+        <w:jc w:val="right"/>
       </w:pPr>
       <w:r>
         <w:rPr>
-          <w:rFonts w:ascii="DejaVu Serif" w:hAnsi="DejaVu Serif"/>
-          <w:b/>
+          <w:rFonts w:ascii="Times New Roman" w:hAnsi="Times New Roman"/>
+          <w:b w:val="0"/>
           <w:color w:val="000000"/>
-          <w:sz w:val="32"/>
+          <w:sz w:val="28"/>
         </w:rPr>
-        <w:t>Проєкт EasyStock</w:t>
+        <w:t>Виконав:</w:t>
+        <w:br/>
+        <w:t>студент групи 3ІПЗс-24</w:t>
+        <w:br/>
+        <w:t>Бондаренко Сергій</w:t>
       </w:r>
     </w:p>
     <w:p>
       <w:pPr>
-        <w:jc w:val="center"/>
+        <w:keepNext w:val="0"/>
+        <w:keepLines/>
+        <w:spacing w:before="160" w:after="0" w:line="240" w:lineRule="auto"/>
+        <w:ind w:left="4320"/>
+        <w:jc w:val="right"/>
       </w:pPr>
       <w:r>
-        <w:t>Вебзастосунок для обліку товарів і складських операцій</w:t>
-      </w:r>
-    </w:p>
-    <w:p>
-      <w:pPr>
-        <w:spacing w:after="440"/>
-      </w:pPr>
-      <w:r/>
-    </w:p>
-    <w:p>
-      <w:r>
         <w:rPr>
-          <w:rFonts w:ascii="DejaVu Serif" w:hAnsi="DejaVu Serif"/>
+          <w:rFonts w:ascii="Times New Roman" w:hAnsi="Times New Roman"/>
           <w:b w:val="0"/>
           <w:color w:val="000000"/>
-          <w:sz w:val="24"/>
+          <w:sz w:val="28"/>
         </w:rPr>
-        <w:t>Виконав: Бондаренко Сергій</w:t>
+        <w:t>Перевірив:</w:t>
         <w:br/>
-        <w:t>Група: 3ІПЗс</w:t>
-        <w:br/>
-        <w:t>Форма виконання: індивідуальна</w:t>
-        <w:br/>
-        <w:t>Дата: 05.10.2026</w:t>
-      </w:r>
-    </w:p>
-    <w:p>
-      <w:r>
-        <w:rPr>
-          <w:rFonts w:ascii="DejaVu Serif" w:hAnsi="DejaVu Serif"/>
-          <w:b/>
-          <w:color w:val="000000"/>
-          <w:sz w:val="23"/>
-        </w:rPr>
-        <w:t>Усю роботу над проєктом і цією лабораторною роботою я виконав самостійно. Я поєднував ролі автора ідеї, аналітика, проєктувальника, розробника, тестувальника та автора документації.</w:t>
-      </w:r>
-    </w:p>
-    <w:p>
-      <w:r>
-        <w:t xml:space="preserve">Репозиторій GitHub: </w:t>
-      </w:r>
-      <w:hyperlink r:id="rId11">
-        <w:r>
-          <w:rPr>
-            <w:color w:val="234D77"/>
-            <w:u w:val="single"/>
-            <w:rFonts w:ascii="DejaVu Serif" w:hAnsi="DejaVu Serif"/>
-          </w:rPr>
-          <w:t>https://github.com/chaek438/EasyStock</w:t>
-        </w:r>
-      </w:hyperlink>
-    </w:p>
-    <w:p>
-      <w:r>
-        <w:rPr>
-          <w:rFonts w:ascii="DejaVu Serif" w:hAnsi="DejaVu Serif"/>
-          <w:b w:val="0"/>
-          <w:color w:val="000000"/>
-          <w:sz w:val="20"/>
-        </w:rPr>
-        <w:t>Перевірена версія main: 8e8a046cee04</w:t>
-      </w:r>
-    </w:p>
-    <w:p>
-      <w:r>
-        <w:rPr>
-          <w:rFonts w:ascii="DejaVu Serif" w:hAnsi="DejaVu Serif"/>
-          <w:b w:val="0"/>
-          <w:color w:val="000000"/>
-          <w:sz w:val="21"/>
-        </w:rPr>
-        <w:t>Ролі «комірник», «менеджер» і «адміністратор» описують користувачів застосунку. Вони не є учасниками розробки.</w:t>
+        <w:t>Ігор Косенко</w:t>
       </w:r>
     </w:p>
     <w:p>
@@ -5575,9 +5592,12 @@
     <w:sectPr>
       <w:headerReference w:type="default" r:id="rId9"/>
       <w:footerReference w:type="default" r:id="rId10"/>
+      <w:headerReference w:type="first" r:id="rId18"/>
+      <w:footerReference w:type="first" r:id="rId19"/>
       <w:pgSz w:w="12240" w:h="15840"/>
       <w:pgMar w:top="1008" w:right="1152" w:bottom="1008" w:left="1152" w:header="360" w:footer="360" w:gutter="0"/>
       <w:cols w:space="720"/>
+      <w:titlePg/>
       <w:docGrid w:linePitch="360"/>
     </w:sectPr>
   </w:body>
@@ -5605,6 +5625,27 @@
 </w:ftr>
 </file>
 
+<file path=word/footer2.xml><?xml version="1.0" encoding="utf-8"?>
+<w:ftr xmlns:m="http://schemas.openxmlformats.org/officeDocument/2006/math" xmlns:mc="http://schemas.openxmlformats.org/markup-compatibility/2006" xmlns:mo="http://schemas.microsoft.com/office/mac/office/2008/main" xmlns:mv="urn:schemas-microsoft-com:mac:vml" xmlns:o="urn:schemas-microsoft-com:office:office" xmlns:r="http://schemas.openxmlformats.org/officeDocument/2006/relationships" xmlns:v="urn:schemas-microsoft-com:vml" xmlns:w10="urn:schemas-microsoft-com:office:word" xmlns:w14="http://schemas.microsoft.com/office/word/2010/wordml" xmlns:w="http://schemas.openxmlformats.org/wordprocessingml/2006/main" xmlns:wne="http://schemas.microsoft.com/office/word/2006/wordml" xmlns:wp14="http://schemas.microsoft.com/office/word/2010/wordprocessingDrawing" xmlns:wp="http://schemas.openxmlformats.org/drawingml/2006/wordprocessingDrawing" xmlns:wpc="http://schemas.microsoft.com/office/word/2010/wordprocessingCanvas" xmlns:wpg="http://schemas.microsoft.com/office/word/2010/wordprocessingGroup" xmlns:wpi="http://schemas.microsoft.com/office/word/2010/wordprocessingInk" xmlns:wps="http://schemas.microsoft.com/office/word/2010/wordprocessingShape" mc:Ignorable="w14 wp14">
+  <w:p>
+    <w:pPr>
+      <w:pStyle w:val="Footer"/>
+      <w:spacing w:after="0"/>
+      <w:jc w:val="center"/>
+    </w:pPr>
+    <w:r>
+      <w:rPr>
+        <w:rFonts w:ascii="Times New Roman" w:hAnsi="Times New Roman"/>
+        <w:b w:val="0"/>
+        <w:color w:val="000000"/>
+        <w:sz w:val="28"/>
+      </w:rPr>
+      <w:t>Хмельницький 2026</w:t>
+    </w:r>
+  </w:p>
+</w:ftr>
+</file>
+
 <file path=word/header1.xml><?xml version="1.0" encoding="utf-8"?>
 <w:hdr xmlns:m="http://schemas.openxmlformats.org/officeDocument/2006/math" xmlns:mc="http://schemas.openxmlformats.org/markup-compatibility/2006" xmlns:mo="http://schemas.microsoft.com/office/mac/office/2008/main" xmlns:mv="urn:schemas-microsoft-com:mac:vml" xmlns:o="urn:schemas-microsoft-com:office:office" xmlns:r="http://schemas.openxmlformats.org/officeDocument/2006/relationships" xmlns:v="urn:schemas-microsoft-com:vml" xmlns:w10="urn:schemas-microsoft-com:office:word" xmlns:w14="http://schemas.microsoft.com/office/word/2010/wordml" xmlns:w="http://schemas.openxmlformats.org/wordprocessingml/2006/main" xmlns:wne="http://schemas.microsoft.com/office/word/2006/wordml" xmlns:wp14="http://schemas.microsoft.com/office/word/2010/wordprocessingDrawing" xmlns:wp="http://schemas.openxmlformats.org/drawingml/2006/wordprocessingDrawing" xmlns:wpc="http://schemas.microsoft.com/office/word/2010/wordprocessingCanvas" xmlns:wpg="http://schemas.microsoft.com/office/word/2010/wordprocessingGroup" xmlns:wpi="http://schemas.microsoft.com/office/word/2010/wordprocessingInk" xmlns:wps="http://schemas.microsoft.com/office/word/2010/wordprocessingShape" mc:Ignorable="w14 wp14">
   <w:p>
@@ -5620,6 +5661,16 @@
       </w:rPr>
       <w:t>EasyStock   |   Проєктний практикум   |   Робота 3</w:t>
     </w:r>
+  </w:p>
+</w:hdr>
+</file>
+
+<file path=word/header2.xml><?xml version="1.0" encoding="utf-8"?>
+<w:hdr xmlns:m="http://schemas.openxmlformats.org/officeDocument/2006/math" xmlns:mc="http://schemas.openxmlformats.org/markup-compatibility/2006" xmlns:mo="http://schemas.microsoft.com/office/mac/office/2008/main" xmlns:mv="urn:schemas-microsoft-com:mac:vml" xmlns:o="urn:schemas-microsoft-com:office:office" xmlns:r="http://schemas.openxmlformats.org/officeDocument/2006/relationships" xmlns:v="urn:schemas-microsoft-com:vml" xmlns:w10="urn:schemas-microsoft-com:office:word" xmlns:w14="http://schemas.microsoft.com/office/word/2010/wordml" xmlns:w="http://schemas.openxmlformats.org/wordprocessingml/2006/main" xmlns:wne="http://schemas.microsoft.com/office/word/2006/wordml" xmlns:wp14="http://schemas.microsoft.com/office/word/2010/wordprocessingDrawing" xmlns:wp="http://schemas.openxmlformats.org/drawingml/2006/wordprocessingDrawing" xmlns:wpc="http://schemas.microsoft.com/office/word/2010/wordprocessingCanvas" xmlns:wpg="http://schemas.microsoft.com/office/word/2010/wordprocessingGroup" xmlns:wpi="http://schemas.microsoft.com/office/word/2010/wordprocessingInk" xmlns:wps="http://schemas.microsoft.com/office/word/2010/wordprocessingShape" mc:Ignorable="w14 wp14">
+  <w:p>
+    <w:pPr>
+      <w:pStyle w:val="Header"/>
+    </w:pPr>
   </w:p>
 </w:hdr>
 </file>

</xml_diff>

<commit_message>
docs(lab3): update reviewer names on report cover
Виконав: Бондаренко Сергій. У блоці «Перевірив» вказано: Дмитро Олегович Чорний; Ілля Володимирович Костевич. Основний текст і схеми звіту без змін.
</commit_message>
<xml_diff>
--- a/docs/Lab3/Report.docx
+++ b/docs/Lab3/Report.docx
@@ -147,7 +147,9 @@
         </w:rPr>
         <w:t>Перевірив:</w:t>
         <w:br/>
-        <w:t>Ігор Косенко</w:t>
+        <w:t>Дмитро Олегович Чорний</w:t>
+        <w:br/>
+        <w:t>Ілля Володимирович Костевич</w:t>
       </w:r>
     </w:p>
     <w:p>

</xml_diff>